<commit_message>
docs: actualiza la justificacion con la integracion del catalogo JDBC y los DTOs
</commit_message>
<xml_diff>
--- a/restaurante-app/docs/Justificacion_Tecnica_Servicios_Controladores_Avance3.docx
+++ b/restaurante-app/docs/Justificacion_Tecnica_Servicios_Controladores_Avance3.docx
@@ -547,7 +547,21 @@
         <w:t>Catálogo:</w:t>
       </w:r>
       <w:r>
-        <w:t xml:space="preserve"> ProductoService se mantiene sobre el contrato ProductoDAO; cuando Alejandra integre ProductoRepositoryJDBC bastará con cambiar la instancia que se inyecta en Main.</w:t>
+        <w:t xml:space="preserve"> ProductoService se adaptó al contrato ProductoDAO de la migración JDBC del catálogo (obtenerTodos, buscarPorId y guardar), y el modelo ItemMenu conserva de forma adicional descripción, existencias, estado e instrucciones de preparación para que las vistas de consola y la regla de venta sigan funcionando con el mismo objeto que persiste el repositorio.</w:t>
+      </w:r>
+    </w:p>
+    <w:p>
+      <w:pPr>
+        <w:pStyle w:val="ListBullet"/>
+      </w:pPr>
+      <w:r>
+        <w:rPr>
+          <w:b/>
+        </w:rPr>
+        <w:t>Reportes:</w:t>
+      </w:r>
+      <w:r>
+        <w:t xml:space="preserve"> los DTOs ComandaDTO y ReporteVentaDTO y el repositorio de reportes se integraron sin cambios; los pedidos que se persisten con estado, total, fecha y precio unitario por línea son la fuente de datos para esa analítica.</w:t>
       </w:r>
     </w:p>
     <w:p>
@@ -635,7 +649,7 @@
         <w:spacing w:after="120"/>
       </w:pPr>
       <w:r>
-        <w:t>Todas las comprobaciones se superaron. Durante esta verificación se detectó un punto de integración pendiente que no pertenece a esta capa: MesaRepositoryJDBC consulta las columnas numero_mesa y zona, mientras que la tabla mesas de schema.sql define numero y capacidad. Las operaciones transaccionales de esta entrega sólo usan la columna estado, por lo que funcionan con ambas versiones, pero el listado de mesas requiere que el script y el repositorio se alineen con el modelo Mesa.</w:t>
+        <w:t>Todas las comprobaciones se superaron. Durante esta verificación se detectó un punto de integración pendiente que no pertenece a esta capa: MesaRepositoryJDBC consulta las columnas numero_mesa y zona, mientras que la tabla mesas de schema.sql define numero y capacidad. Las operaciones transaccionales de esta entrega sólo usan la columna estado, por lo que funcionan con ambas versiones, pero el listado de mesas requiere que el script y el repositorio se alineen con el modelo Mesa. De igual forma, el repositorio JDBC de productos lee la columna tipo y el de reportes las columnas turno y plato_mas_vendido, que schema.sql todavía no define.</w:t>
       </w:r>
     </w:p>
     <w:sectPr>

</xml_diff>